<commit_message>
Add authentication (JWT), login UI, and protected routes
</commit_message>
<xml_diff>
--- a/documentation/Звіт.docx
+++ b/documentation/Звіт.docx
@@ -2606,17 +2606,7 @@
           <w:bCs/>
           <w:color w:val="000000" w:themeColor="text1"/>
         </w:rPr>
-        <w:t xml:space="preserve">Лабораторна робота </w:t>
-      </w:r>
-      <w:r>
-        <w:rPr>
-          <w:rStyle w:val="20"/>
-          <w:rFonts w:ascii="Times New Roman" w:hAnsi="Times New Roman" w:cs="Times New Roman"/>
-          <w:b/>
-          <w:bCs/>
-          <w:color w:val="000000" w:themeColor="text1"/>
-        </w:rPr>
-        <w:t>2</w:t>
+        <w:t>Лабораторна робота 2</w:t>
       </w:r>
     </w:p>
     <w:p>
@@ -2782,6 +2772,7 @@
     </w:p>
     <w:p>
       <w:pPr>
+        <w:ind w:hanging="851"/>
         <w:jc w:val="center"/>
         <w:rPr>
           <w:rFonts w:ascii="Times New Roman" w:hAnsi="Times New Roman" w:cs="Times New Roman"/>
@@ -2789,24 +2780,36 @@
           <w:bCs/>
           <w:sz w:val="28"/>
           <w:szCs w:val="28"/>
-          <w:lang w:val="ru-RU"/>
-        </w:rPr>
-      </w:pPr>
-      <w:r>
-        <w:rPr>
-          <w:rFonts w:ascii="Times New Roman" w:hAnsi="Times New Roman" w:cs="Times New Roman"/>
-          <w:b/>
-          <w:bCs/>
-          <w:noProof/>
-          <w:sz w:val="28"/>
-          <w:szCs w:val="28"/>
-          <w:lang w:val="ru-RU"/>
+          <w:lang w:val="en-US"/>
+        </w:rPr>
+      </w:pPr>
+    </w:p>
+    <w:p>
+      <w:pPr>
+        <w:jc w:val="center"/>
+        <w:rPr>
+          <w:rFonts w:ascii="Times New Roman" w:hAnsi="Times New Roman" w:cs="Times New Roman"/>
+          <w:b/>
+          <w:bCs/>
+          <w:sz w:val="28"/>
+          <w:szCs w:val="28"/>
+          <w:lang w:val="en-US"/>
+        </w:rPr>
+      </w:pPr>
+      <w:r>
+        <w:rPr>
+          <w:rFonts w:ascii="Times New Roman" w:hAnsi="Times New Roman" w:cs="Times New Roman"/>
+          <w:b/>
+          <w:bCs/>
+          <w:sz w:val="28"/>
+          <w:szCs w:val="28"/>
+          <w:lang w:val="en-US"/>
         </w:rPr>
         <w:drawing>
-          <wp:inline distT="0" distB="0" distL="0" distR="0" wp14:anchorId="06CE56D8" wp14:editId="27220284">
-            <wp:extent cx="5350934" cy="2292522"/>
-            <wp:effectExtent l="0" t="0" r="2540" b="0"/>
-            <wp:docPr id="1194855159" name="Рисунок 2" descr="Изображение выглядит как текст, снимок экрана, Шрифт, диаграмма&#10;&#10;Содержимое, созданное искусственным интеллектом, может быть неверным."/>
+          <wp:inline distT="0" distB="0" distL="0" distR="0" wp14:anchorId="224393C5" wp14:editId="4F4857FC">
+            <wp:extent cx="5295900" cy="1867010"/>
+            <wp:effectExtent l="0" t="0" r="0" b="0"/>
+            <wp:docPr id="1449843650" name="Рисунок 1" descr="Изображение выглядит как снимок экрана, диаграмма, 3D-моделирование&#10;&#10;Содержимое, созданное искусственным интеллектом, может быть неверным."/>
             <wp:cNvGraphicFramePr>
               <a:graphicFrameLocks xmlns:a="http://schemas.openxmlformats.org/drawingml/2006/main" noChangeAspect="1"/>
             </wp:cNvGraphicFramePr>
@@ -2814,17 +2817,11 @@
               <a:graphicData uri="http://schemas.openxmlformats.org/drawingml/2006/picture">
                 <pic:pic xmlns:pic="http://schemas.openxmlformats.org/drawingml/2006/picture">
                   <pic:nvPicPr>
-                    <pic:cNvPr id="1194855159" name="Рисунок 2" descr="Изображение выглядит как текст, снимок экрана, Шрифт, диаграмма&#10;&#10;Содержимое, созданное искусственным интеллектом, может быть неверным."/>
+                    <pic:cNvPr id="1449843650" name="Рисунок 1" descr="Изображение выглядит как снимок экрана, диаграмма, 3D-моделирование&#10;&#10;Содержимое, созданное искусственным интеллектом, может быть неверным."/>
                     <pic:cNvPicPr/>
                   </pic:nvPicPr>
                   <pic:blipFill>
-                    <a:blip r:embed="rId7" cstate="print">
-                      <a:extLst>
-                        <a:ext uri="{28A0092B-C50C-407E-A947-70E740481C1C}">
-                          <a14:useLocalDpi xmlns:a14="http://schemas.microsoft.com/office/drawing/2010/main" val="0"/>
-                        </a:ext>
-                      </a:extLst>
-                    </a:blip>
+                    <a:blip r:embed="rId7"/>
                     <a:stretch>
                       <a:fillRect/>
                     </a:stretch>
@@ -2832,7 +2829,7 @@
                   <pic:spPr>
                     <a:xfrm>
                       <a:off x="0" y="0"/>
-                      <a:ext cx="5357312" cy="2295254"/>
+                      <a:ext cx="5307116" cy="1870964"/>
                     </a:xfrm>
                     <a:prstGeom prst="rect">
                       <a:avLst/>
@@ -2939,16 +2936,15 @@
           <w:rFonts w:ascii="Times New Roman" w:hAnsi="Times New Roman" w:cs="Times New Roman"/>
           <w:b/>
           <w:bCs/>
-          <w:noProof/>
           <w:sz w:val="28"/>
           <w:szCs w:val="28"/>
           <w:lang w:val="ru-RU"/>
         </w:rPr>
         <w:drawing>
-          <wp:inline distT="0" distB="0" distL="0" distR="0" wp14:anchorId="0D885505" wp14:editId="32A60BDE">
-            <wp:extent cx="3598334" cy="2267085"/>
-            <wp:effectExtent l="0" t="0" r="2540" b="0"/>
-            <wp:docPr id="361521104" name="Рисунок 3" descr="Изображение выглядит как текст, снимок экрана, Шрифт, диаграмма&#10;&#10;Содержимое, созданное искусственным интеллектом, может быть неверным."/>
+          <wp:inline distT="0" distB="0" distL="0" distR="0" wp14:anchorId="20964AA6" wp14:editId="4993A4CC">
+            <wp:extent cx="5940425" cy="2680335"/>
+            <wp:effectExtent l="0" t="0" r="3175" b="5715"/>
+            <wp:docPr id="343852090" name="Рисунок 1" descr="Изображение выглядит как снимок экрана, текст, диаграмма&#10;&#10;Содержимое, созданное искусственным интеллектом, может быть неверным."/>
             <wp:cNvGraphicFramePr>
               <a:graphicFrameLocks xmlns:a="http://schemas.openxmlformats.org/drawingml/2006/main" noChangeAspect="1"/>
             </wp:cNvGraphicFramePr>
@@ -2956,17 +2952,11 @@
               <a:graphicData uri="http://schemas.openxmlformats.org/drawingml/2006/picture">
                 <pic:pic xmlns:pic="http://schemas.openxmlformats.org/drawingml/2006/picture">
                   <pic:nvPicPr>
-                    <pic:cNvPr id="361521104" name="Рисунок 3" descr="Изображение выглядит как текст, снимок экрана, Шрифт, диаграмма&#10;&#10;Содержимое, созданное искусственным интеллектом, может быть неверным."/>
+                    <pic:cNvPr id="343852090" name="Рисунок 1" descr="Изображение выглядит как снимок экрана, текст, диаграмма&#10;&#10;Содержимое, созданное искусственным интеллектом, может быть неверным."/>
                     <pic:cNvPicPr/>
                   </pic:nvPicPr>
                   <pic:blipFill>
-                    <a:blip r:embed="rId8" cstate="print">
-                      <a:extLst>
-                        <a:ext uri="{28A0092B-C50C-407E-A947-70E740481C1C}">
-                          <a14:useLocalDpi xmlns:a14="http://schemas.microsoft.com/office/drawing/2010/main" val="0"/>
-                        </a:ext>
-                      </a:extLst>
-                    </a:blip>
+                    <a:blip r:embed="rId8"/>
                     <a:stretch>
                       <a:fillRect/>
                     </a:stretch>
@@ -2974,7 +2964,7 @@
                   <pic:spPr>
                     <a:xfrm>
                       <a:off x="0" y="0"/>
-                      <a:ext cx="3606361" cy="2272142"/>
+                      <a:ext cx="5940425" cy="2680335"/>
                     </a:xfrm>
                     <a:prstGeom prst="rect">
                       <a:avLst/>
@@ -3022,6 +3012,7 @@
           <w:sz w:val="28"/>
           <w:szCs w:val="28"/>
         </w:rPr>
+        <w:lastRenderedPageBreak/>
         <w:t>SPA (React): Відповідає за візуалізацію даних (курси, словник) та взаємодію з користувачем.</w:t>
       </w:r>
     </w:p>
@@ -3043,7 +3034,6 @@
           <w:sz w:val="28"/>
           <w:szCs w:val="28"/>
         </w:rPr>
-        <w:lastRenderedPageBreak/>
         <w:t>API (Node.js/Express): Виступає шлюзом до даних, реалізує REST API ендпоінти.</w:t>
       </w:r>
     </w:p>
@@ -3106,53 +3096,60 @@
           <w:rFonts w:ascii="Times New Roman" w:hAnsi="Times New Roman" w:cs="Times New Roman"/>
           <w:sz w:val="28"/>
           <w:szCs w:val="28"/>
-        </w:rPr>
-      </w:pPr>
-      <w:r>
-        <w:rPr>
-          <w:rFonts w:ascii="Times New Roman" w:hAnsi="Times New Roman" w:cs="Times New Roman"/>
-          <w:sz w:val="28"/>
-          <w:szCs w:val="28"/>
-        </w:rPr>
-        <w:t>Ця діаграма "відкриває" контейнер API Application. Вона показує, як організований код на бекенді, базуючись на твоїй схемі бази даних.</w:t>
-      </w:r>
-    </w:p>
-    <w:p>
-      <w:pPr>
-        <w:rPr>
-          <w:rFonts w:ascii="Times New Roman" w:hAnsi="Times New Roman" w:cs="Times New Roman"/>
-          <w:sz w:val="28"/>
-          <w:szCs w:val="28"/>
-        </w:rPr>
-      </w:pPr>
-    </w:p>
-    <w:p>
-      <w:pPr>
-        <w:jc w:val="center"/>
-        <w:rPr>
-          <w:rFonts w:ascii="Times New Roman" w:hAnsi="Times New Roman" w:cs="Times New Roman"/>
-          <w:b/>
-          <w:bCs/>
-          <w:sz w:val="28"/>
-          <w:szCs w:val="28"/>
-          <w:lang w:val="ru-RU"/>
-        </w:rPr>
-      </w:pPr>
-      <w:r>
-        <w:rPr>
-          <w:rFonts w:ascii="Times New Roman" w:hAnsi="Times New Roman" w:cs="Times New Roman"/>
-          <w:b/>
-          <w:bCs/>
-          <w:noProof/>
-          <w:sz w:val="28"/>
-          <w:szCs w:val="28"/>
-          <w:lang w:val="ru-RU"/>
+          <w:lang w:val="ru-UA"/>
+        </w:rPr>
+      </w:pPr>
+      <w:r>
+        <w:rPr>
+          <w:rFonts w:ascii="Times New Roman" w:hAnsi="Times New Roman" w:cs="Times New Roman"/>
+          <w:sz w:val="28"/>
+          <w:szCs w:val="28"/>
+          <w:lang w:val="ru-UA"/>
+        </w:rPr>
+        <w:t xml:space="preserve">Ця діаграма «відкриває» контейнер </w:t>
+      </w:r>
+      <w:r>
+        <w:rPr>
+          <w:rFonts w:ascii="Times New Roman" w:hAnsi="Times New Roman" w:cs="Times New Roman"/>
+          <w:b/>
+          <w:bCs/>
+          <w:sz w:val="28"/>
+          <w:szCs w:val="28"/>
+          <w:lang w:val="ru-UA"/>
+        </w:rPr>
+        <w:t>API Application</w:t>
+      </w:r>
+      <w:r>
+        <w:rPr>
+          <w:rFonts w:ascii="Times New Roman" w:hAnsi="Times New Roman" w:cs="Times New Roman"/>
+          <w:sz w:val="28"/>
+          <w:szCs w:val="28"/>
+          <w:lang w:val="ru-UA"/>
+        </w:rPr>
+        <w:t>, демонструючи внутрішню організацію бекенд-коду та розподіл обов'язків між модулями.</w:t>
+      </w:r>
+    </w:p>
+    <w:p>
+      <w:pPr>
+        <w:rPr>
+          <w:rFonts w:ascii="Times New Roman" w:hAnsi="Times New Roman" w:cs="Times New Roman"/>
+          <w:sz w:val="28"/>
+          <w:szCs w:val="28"/>
+          <w:lang w:val="ru-UA"/>
+        </w:rPr>
+      </w:pPr>
+      <w:r>
+        <w:rPr>
+          <w:rFonts w:ascii="Times New Roman" w:hAnsi="Times New Roman" w:cs="Times New Roman"/>
+          <w:sz w:val="28"/>
+          <w:szCs w:val="28"/>
+          <w:lang w:val="ru-UA"/>
         </w:rPr>
         <w:drawing>
-          <wp:inline distT="0" distB="0" distL="0" distR="0" wp14:anchorId="78D6E88A" wp14:editId="18D4B164">
-            <wp:extent cx="4478867" cy="3733426"/>
-            <wp:effectExtent l="0" t="0" r="0" b="635"/>
-            <wp:docPr id="1649791280" name="Рисунок 4" descr="Изображение выглядит как текст, снимок экрана, диаграмма, Шрифт&#10;&#10;Содержимое, созданное искусственным интеллектом, может быть неверным."/>
+          <wp:inline distT="0" distB="0" distL="0" distR="0" wp14:anchorId="74E55220" wp14:editId="0789F265">
+            <wp:extent cx="5940425" cy="3230245"/>
+            <wp:effectExtent l="0" t="0" r="3175" b="8255"/>
+            <wp:docPr id="1659909734" name="Рисунок 1"/>
             <wp:cNvGraphicFramePr>
               <a:graphicFrameLocks xmlns:a="http://schemas.openxmlformats.org/drawingml/2006/main" noChangeAspect="1"/>
             </wp:cNvGraphicFramePr>
@@ -3160,17 +3157,11 @@
               <a:graphicData uri="http://schemas.openxmlformats.org/drawingml/2006/picture">
                 <pic:pic xmlns:pic="http://schemas.openxmlformats.org/drawingml/2006/picture">
                   <pic:nvPicPr>
-                    <pic:cNvPr id="1649791280" name="Рисунок 4" descr="Изображение выглядит как текст, снимок экрана, диаграмма, Шрифт&#10;&#10;Содержимое, созданное искусственным интеллектом, может быть неверным."/>
+                    <pic:cNvPr id="1659909734" name=""/>
                     <pic:cNvPicPr/>
                   </pic:nvPicPr>
                   <pic:blipFill>
-                    <a:blip r:embed="rId9" cstate="print">
-                      <a:extLst>
-                        <a:ext uri="{28A0092B-C50C-407E-A947-70E740481C1C}">
-                          <a14:useLocalDpi xmlns:a14="http://schemas.microsoft.com/office/drawing/2010/main" val="0"/>
-                        </a:ext>
-                      </a:extLst>
-                    </a:blip>
+                    <a:blip r:embed="rId9"/>
                     <a:stretch>
                       <a:fillRect/>
                     </a:stretch>
@@ -3178,7 +3169,7 @@
                   <pic:spPr>
                     <a:xfrm>
                       <a:off x="0" y="0"/>
-                      <a:ext cx="4487511" cy="3740632"/>
+                      <a:ext cx="5940425" cy="3230245"/>
                     </a:xfrm>
                     <a:prstGeom prst="rect">
                       <a:avLst/>
@@ -3197,111 +3188,302 @@
           <w:rFonts w:ascii="Times New Roman" w:hAnsi="Times New Roman" w:cs="Times New Roman"/>
           <w:sz w:val="28"/>
           <w:szCs w:val="28"/>
-        </w:rPr>
-      </w:pPr>
-      <w:r>
-        <w:rPr>
-          <w:rFonts w:ascii="Times New Roman" w:hAnsi="Times New Roman" w:cs="Times New Roman"/>
-          <w:sz w:val="28"/>
-          <w:szCs w:val="28"/>
-        </w:rPr>
-        <w:t>Компоненти API розділені за зонами відповідальності, що відповідають групам таблиць у базі даних:</w:t>
+          <w:lang w:val="ru-UA"/>
+        </w:rPr>
+      </w:pPr>
+      <w:r>
+        <w:rPr>
+          <w:rFonts w:ascii="Times New Roman" w:hAnsi="Times New Roman" w:cs="Times New Roman"/>
+          <w:sz w:val="28"/>
+          <w:szCs w:val="28"/>
+          <w:lang w:val="ru-UA"/>
+        </w:rPr>
+        <w:t>Компоненти API структуровані за зонами відповідальності, що корелюють із відповідними групами таблиць у базі даних PostgreSQL:</w:t>
       </w:r>
     </w:p>
     <w:p>
       <w:pPr>
         <w:numPr>
           <w:ilvl w:val="0"/>
-          <w:numId w:val="13"/>
+          <w:numId w:val="14"/>
         </w:numPr>
         <w:rPr>
           <w:rFonts w:ascii="Times New Roman" w:hAnsi="Times New Roman" w:cs="Times New Roman"/>
           <w:sz w:val="28"/>
           <w:szCs w:val="28"/>
-        </w:rPr>
-      </w:pPr>
-      <w:r>
-        <w:rPr>
-          <w:rFonts w:ascii="Times New Roman" w:hAnsi="Times New Roman" w:cs="Times New Roman"/>
-          <w:sz w:val="28"/>
-          <w:szCs w:val="28"/>
-        </w:rPr>
-        <w:t>Course Controller: Працює з таблицями courses, lessons, pages, rules.</w:t>
+          <w:lang w:val="ru-UA"/>
+        </w:rPr>
+      </w:pPr>
+      <w:r>
+        <w:rPr>
+          <w:rFonts w:ascii="Times New Roman" w:hAnsi="Times New Roman" w:cs="Times New Roman"/>
+          <w:b/>
+          <w:bCs/>
+          <w:sz w:val="28"/>
+          <w:szCs w:val="28"/>
+          <w:lang w:val="ru-UA"/>
+        </w:rPr>
+        <w:t>Course Controller (apiPages.js</w:t>
+      </w:r>
+      <w:r>
+        <w:rPr>
+          <w:rFonts w:ascii="Times New Roman" w:hAnsi="Times New Roman" w:cs="Times New Roman"/>
+          <w:b/>
+          <w:bCs/>
+          <w:sz w:val="28"/>
+          <w:szCs w:val="28"/>
+          <w:lang w:val="ru-UA"/>
+        </w:rPr>
+        <w:t>,</w:t>
+      </w:r>
+      <w:r>
+        <w:rPr>
+          <w:rFonts w:ascii="Times New Roman" w:hAnsi="Times New Roman" w:cs="Times New Roman"/>
+          <w:b/>
+          <w:bCs/>
+          <w:sz w:val="28"/>
+          <w:szCs w:val="28"/>
+          <w:lang w:val="ru-UA"/>
+        </w:rPr>
+        <w:t xml:space="preserve"> </w:t>
+      </w:r>
+      <w:r>
+        <w:rPr>
+          <w:rFonts w:ascii="Times New Roman" w:hAnsi="Times New Roman" w:cs="Times New Roman"/>
+          <w:b/>
+          <w:bCs/>
+          <w:sz w:val="28"/>
+          <w:szCs w:val="28"/>
+          <w:lang w:val="ru-UA"/>
+        </w:rPr>
+        <w:t>apiCourses.js, apiLessons.js, apiLessons</w:t>
+      </w:r>
+      <w:r>
+        <w:rPr>
+          <w:rFonts w:ascii="Times New Roman" w:hAnsi="Times New Roman" w:cs="Times New Roman"/>
+          <w:b/>
+          <w:bCs/>
+          <w:sz w:val="28"/>
+          <w:szCs w:val="28"/>
+          <w:lang w:val="ru-UA"/>
+        </w:rPr>
+        <w:t>One</w:t>
+      </w:r>
+      <w:r>
+        <w:rPr>
+          <w:rFonts w:ascii="Times New Roman" w:hAnsi="Times New Roman" w:cs="Times New Roman"/>
+          <w:b/>
+          <w:bCs/>
+          <w:sz w:val="28"/>
+          <w:szCs w:val="28"/>
+          <w:lang w:val="ru-UA"/>
+        </w:rPr>
+        <w:t>.js</w:t>
+      </w:r>
+      <w:r>
+        <w:rPr>
+          <w:rFonts w:ascii="Times New Roman" w:hAnsi="Times New Roman" w:cs="Times New Roman"/>
+          <w:b/>
+          <w:bCs/>
+          <w:sz w:val="28"/>
+          <w:szCs w:val="28"/>
+          <w:lang w:val="ru-UA"/>
+        </w:rPr>
+        <w:t>)</w:t>
+      </w:r>
+      <w:r>
+        <w:rPr>
+          <w:rFonts w:ascii="Times New Roman" w:hAnsi="Times New Roman" w:cs="Times New Roman"/>
+          <w:sz w:val="28"/>
+          <w:szCs w:val="28"/>
+          <w:lang w:val="ru-UA"/>
+        </w:rPr>
+        <w:t>:</w:t>
+      </w:r>
+    </w:p>
+    <w:p>
+      <w:pPr>
+        <w:numPr>
+          <w:ilvl w:val="1"/>
+          <w:numId w:val="14"/>
+        </w:numPr>
+        <w:rPr>
+          <w:rFonts w:ascii="Times New Roman" w:hAnsi="Times New Roman" w:cs="Times New Roman"/>
+          <w:sz w:val="28"/>
+          <w:szCs w:val="28"/>
+          <w:lang w:val="ru-UA"/>
+        </w:rPr>
+      </w:pPr>
+      <w:r>
+        <w:rPr>
+          <w:rFonts w:ascii="Times New Roman" w:hAnsi="Times New Roman" w:cs="Times New Roman"/>
+          <w:sz w:val="28"/>
+          <w:szCs w:val="28"/>
+          <w:lang w:val="ru-UA"/>
+        </w:rPr>
+        <w:t>Керує структурою навчального контенту.</w:t>
+      </w:r>
+    </w:p>
+    <w:p>
+      <w:pPr>
+        <w:numPr>
+          <w:ilvl w:val="1"/>
+          <w:numId w:val="14"/>
+        </w:numPr>
+        <w:rPr>
+          <w:rFonts w:ascii="Times New Roman" w:hAnsi="Times New Roman" w:cs="Times New Roman"/>
+          <w:sz w:val="28"/>
+          <w:szCs w:val="28"/>
+          <w:lang w:val="ru-UA"/>
+        </w:rPr>
+      </w:pPr>
+      <w:r>
+        <w:rPr>
+          <w:rFonts w:ascii="Times New Roman" w:hAnsi="Times New Roman" w:cs="Times New Roman"/>
+          <w:sz w:val="28"/>
+          <w:szCs w:val="28"/>
+          <w:lang w:val="ru-UA"/>
+        </w:rPr>
+        <w:t>Взаємодіє з таблицями: courses, lessons, pages, rules.</w:t>
       </w:r>
     </w:p>
     <w:p>
       <w:pPr>
         <w:numPr>
           <w:ilvl w:val="0"/>
-          <w:numId w:val="13"/>
+          <w:numId w:val="14"/>
         </w:numPr>
         <w:rPr>
           <w:rFonts w:ascii="Times New Roman" w:hAnsi="Times New Roman" w:cs="Times New Roman"/>
           <w:sz w:val="28"/>
           <w:szCs w:val="28"/>
-        </w:rPr>
-      </w:pPr>
-      <w:r>
-        <w:rPr>
-          <w:rFonts w:ascii="Times New Roman" w:hAnsi="Times New Roman" w:cs="Times New Roman"/>
-          <w:sz w:val="28"/>
-          <w:szCs w:val="28"/>
-        </w:rPr>
-        <w:t>Task Controller: Відповідає за логіку тестування (tasks, user_results).</w:t>
+          <w:lang w:val="ru-UA"/>
+        </w:rPr>
+      </w:pPr>
+      <w:r>
+        <w:rPr>
+          <w:rFonts w:ascii="Times New Roman" w:hAnsi="Times New Roman" w:cs="Times New Roman"/>
+          <w:b/>
+          <w:bCs/>
+          <w:sz w:val="28"/>
+          <w:szCs w:val="28"/>
+          <w:lang w:val="ru-UA"/>
+        </w:rPr>
+        <w:t>Task Controller (apiEnglishTaskAI.js)</w:t>
+      </w:r>
+      <w:r>
+        <w:rPr>
+          <w:rFonts w:ascii="Times New Roman" w:hAnsi="Times New Roman" w:cs="Times New Roman"/>
+          <w:sz w:val="28"/>
+          <w:szCs w:val="28"/>
+          <w:lang w:val="ru-UA"/>
+        </w:rPr>
+        <w:t>:</w:t>
+      </w:r>
+    </w:p>
+    <w:p>
+      <w:pPr>
+        <w:numPr>
+          <w:ilvl w:val="1"/>
+          <w:numId w:val="14"/>
+        </w:numPr>
+        <w:rPr>
+          <w:rFonts w:ascii="Times New Roman" w:hAnsi="Times New Roman" w:cs="Times New Roman"/>
+          <w:sz w:val="28"/>
+          <w:szCs w:val="28"/>
+          <w:lang w:val="ru-UA"/>
+        </w:rPr>
+      </w:pPr>
+      <w:r>
+        <w:rPr>
+          <w:rFonts w:ascii="Times New Roman" w:hAnsi="Times New Roman" w:cs="Times New Roman"/>
+          <w:sz w:val="28"/>
+          <w:szCs w:val="28"/>
+          <w:lang w:val="ru-UA"/>
+        </w:rPr>
+        <w:t>Відповідає за логіку тестування та інтеграцію з ШІ для генерації завдань.</w:t>
       </w:r>
     </w:p>
     <w:p>
       <w:pPr>
         <w:numPr>
           <w:ilvl w:val="0"/>
-          <w:numId w:val="13"/>
+          <w:numId w:val="14"/>
         </w:numPr>
         <w:rPr>
           <w:rFonts w:ascii="Times New Roman" w:hAnsi="Times New Roman" w:cs="Times New Roman"/>
           <w:sz w:val="28"/>
           <w:szCs w:val="28"/>
-        </w:rPr>
-      </w:pPr>
-      <w:r>
-        <w:rPr>
-          <w:rFonts w:ascii="Times New Roman" w:hAnsi="Times New Roman" w:cs="Times New Roman"/>
-          <w:sz w:val="28"/>
-          <w:szCs w:val="28"/>
-        </w:rPr>
-        <w:t>Dictionary Controller: Керує загальним словником (dictionary) та особистим словником користувача (user_dictionary).</w:t>
+          <w:lang w:val="ru-UA"/>
+        </w:rPr>
+      </w:pPr>
+      <w:r>
+        <w:rPr>
+          <w:rFonts w:ascii="Times New Roman" w:hAnsi="Times New Roman" w:cs="Times New Roman"/>
+          <w:b/>
+          <w:bCs/>
+          <w:sz w:val="28"/>
+          <w:szCs w:val="28"/>
+          <w:lang w:val="ru-UA"/>
+        </w:rPr>
+        <w:lastRenderedPageBreak/>
+        <w:t>Auth &amp; User Controller (apiLogin.js, apiRegistration.js, apiMe.js)</w:t>
+      </w:r>
+      <w:r>
+        <w:rPr>
+          <w:rFonts w:ascii="Times New Roman" w:hAnsi="Times New Roman" w:cs="Times New Roman"/>
+          <w:sz w:val="28"/>
+          <w:szCs w:val="28"/>
+          <w:lang w:val="ru-UA"/>
+        </w:rPr>
+        <w:t>:</w:t>
       </w:r>
     </w:p>
     <w:p>
       <w:pPr>
         <w:numPr>
-          <w:ilvl w:val="0"/>
-          <w:numId w:val="13"/>
+          <w:ilvl w:val="1"/>
+          <w:numId w:val="14"/>
         </w:numPr>
         <w:rPr>
           <w:rFonts w:ascii="Times New Roman" w:hAnsi="Times New Roman" w:cs="Times New Roman"/>
           <w:sz w:val="28"/>
           <w:szCs w:val="28"/>
-        </w:rPr>
-      </w:pPr>
-      <w:r>
-        <w:rPr>
-          <w:rFonts w:ascii="Times New Roman" w:hAnsi="Times New Roman" w:cs="Times New Roman"/>
-          <w:sz w:val="28"/>
-          <w:szCs w:val="28"/>
-        </w:rPr>
-        <w:t>Data Access Layer: Шар, який безпосередньо виконує SQL-запити до PostgreSQL, ізолюючи бізнес-логіку від роботи з БД.</w:t>
-      </w:r>
-    </w:p>
-    <w:p>
-      <w:pPr>
-        <w:rPr>
-          <w:rFonts w:ascii="Times New Roman" w:hAnsi="Times New Roman" w:cs="Times New Roman"/>
-          <w:b/>
-          <w:bCs/>
-          <w:sz w:val="28"/>
-          <w:szCs w:val="28"/>
-        </w:rPr>
-      </w:pPr>
+          <w:lang w:val="ru-UA"/>
+        </w:rPr>
+      </w:pPr>
+      <w:r>
+        <w:rPr>
+          <w:rFonts w:ascii="Times New Roman" w:hAnsi="Times New Roman" w:cs="Times New Roman"/>
+          <w:sz w:val="28"/>
+          <w:szCs w:val="28"/>
+          <w:lang w:val="ru-UA"/>
+        </w:rPr>
+        <w:t>Забезпечує безпеку, реєстрацію та керування профілями.</w:t>
+      </w:r>
+    </w:p>
+    <w:p>
+      <w:pPr>
+        <w:numPr>
+          <w:ilvl w:val="1"/>
+          <w:numId w:val="14"/>
+        </w:numPr>
+        <w:rPr>
+          <w:rFonts w:ascii="Times New Roman" w:hAnsi="Times New Roman" w:cs="Times New Roman"/>
+          <w:sz w:val="28"/>
+          <w:szCs w:val="28"/>
+          <w:lang w:val="ru-UA"/>
+        </w:rPr>
+      </w:pPr>
+      <w:r>
+        <w:rPr>
+          <w:rFonts w:ascii="Times New Roman" w:hAnsi="Times New Roman" w:cs="Times New Roman"/>
+          <w:sz w:val="28"/>
+          <w:szCs w:val="28"/>
+          <w:lang w:val="ru-UA"/>
+        </w:rPr>
+        <w:t>Взаємодіє з таблицями: users, sessions.</w:t>
+      </w:r>
     </w:p>
     <w:p>
       <w:pPr>
@@ -3321,7 +3503,6 @@
           <w:bCs/>
           <w:color w:val="000000" w:themeColor="text1"/>
         </w:rPr>
-        <w:lastRenderedPageBreak/>
         <w:t>Лабораторна робота 3</w:t>
       </w:r>
     </w:p>
@@ -3363,6 +3544,7 @@
         <w:rPr>
           <w:rStyle w:val="20"/>
           <w:rFonts w:ascii="Times New Roman" w:hAnsi="Times New Roman" w:cs="Times New Roman"/>
+          <w:noProof/>
           <w:color w:val="000000" w:themeColor="text1"/>
           <w:sz w:val="28"/>
           <w:szCs w:val="28"/>
@@ -3444,7 +3626,17 @@
           <w:sz w:val="28"/>
           <w:szCs w:val="28"/>
         </w:rPr>
-        <w:t>Архітектура додатка побудована на модульному принципі. Бізнес-логіка обробки запитів інкапсульована у відповідних модулях маршрутизації (Routers). Використання ES Modules (import/export) забезпечує слабку зв'язність компонентів (Dependency Injection через модульну систему Node.js). Обробники маршрутів виконують валідацію та формують запити до бази даних.</w:t>
+        <w:t xml:space="preserve">Архітектура додатка побудована на модульному принципі. Бізнес-логіка обробки запитів інкапсульована у відповідних модулях маршрутизації (Routers). Використання ES Modules (import/export) забезпечує слабку зв'язність компонентів (Dependency Injection через модульну систему </w:t>
+      </w:r>
+      <w:r>
+        <w:rPr>
+          <w:rFonts w:ascii="Times New Roman" w:eastAsiaTheme="majorEastAsia" w:hAnsi="Times New Roman" w:cs="Times New Roman"/>
+          <w:color w:val="000000" w:themeColor="text1"/>
+          <w:sz w:val="28"/>
+          <w:szCs w:val="28"/>
+        </w:rPr>
+        <w:lastRenderedPageBreak/>
+        <w:t>Node.js). Обробники маршрутів виконують валідацію та формують запити до бази даних.</w:t>
       </w:r>
     </w:p>
     <w:p>
@@ -3462,6 +3654,7 @@
         <w:rPr>
           <w:rStyle w:val="20"/>
           <w:rFonts w:ascii="Times New Roman" w:hAnsi="Times New Roman" w:cs="Times New Roman"/>
+          <w:noProof/>
           <w:color w:val="000000" w:themeColor="text1"/>
           <w:sz w:val="28"/>
           <w:szCs w:val="28"/>
@@ -3521,7 +3714,6 @@
           <w:sz w:val="28"/>
           <w:szCs w:val="28"/>
         </w:rPr>
-        <w:lastRenderedPageBreak/>
         <w:t>Реалізація API (RESTful API)</w:t>
       </w:r>
     </w:p>
@@ -3562,6 +3754,7 @@
         <w:rPr>
           <w:rStyle w:val="20"/>
           <w:rFonts w:ascii="Times New Roman" w:hAnsi="Times New Roman" w:cs="Times New Roman"/>
+          <w:noProof/>
           <w:color w:val="000000" w:themeColor="text1"/>
           <w:sz w:val="28"/>
           <w:szCs w:val="28"/>
@@ -3641,6 +3834,7 @@
         <w:rPr>
           <w:rStyle w:val="20"/>
           <w:rFonts w:ascii="Times New Roman" w:hAnsi="Times New Roman" w:cs="Times New Roman"/>
+          <w:noProof/>
           <w:color w:val="000000" w:themeColor="text1"/>
           <w:sz w:val="28"/>
           <w:szCs w:val="28"/>
@@ -3713,6 +3907,7 @@
         <w:rPr>
           <w:rStyle w:val="20"/>
           <w:rFonts w:ascii="Times New Roman" w:hAnsi="Times New Roman" w:cs="Times New Roman"/>
+          <w:noProof/>
           <w:color w:val="000000" w:themeColor="text1"/>
           <w:sz w:val="28"/>
           <w:szCs w:val="28"/>
@@ -3764,7 +3959,7 @@
           <w:color w:val="000000" w:themeColor="text1"/>
           <w:sz w:val="28"/>
           <w:szCs w:val="28"/>
-          <w:lang w:val="ru-RU"/>
+          <w:lang w:val="en-US"/>
         </w:rPr>
       </w:pPr>
       <w:r>
@@ -3844,6 +4039,7 @@
         <w:rPr>
           <w:rStyle w:val="20"/>
           <w:rFonts w:ascii="Times New Roman" w:hAnsi="Times New Roman" w:cs="Times New Roman"/>
+          <w:noProof/>
           <w:color w:val="000000" w:themeColor="text1"/>
           <w:sz w:val="28"/>
           <w:szCs w:val="28"/>
@@ -5502,6 +5698,123 @@
     </w:lvl>
   </w:abstractNum>
   <w:abstractNum w:abstractNumId="11" w15:restartNumberingAfterBreak="0">
+    <w:nsid w:val="5C265E25"/>
+    <w:multiLevelType w:val="multilevel"/>
+    <w:tmpl w:val="E5D01B76"/>
+    <w:lvl w:ilvl="0">
+      <w:start w:val="1"/>
+      <w:numFmt w:val="decimal"/>
+      <w:lvlText w:val="%1."/>
+      <w:lvlJc w:val="left"/>
+      <w:pPr>
+        <w:tabs>
+          <w:tab w:val="num" w:pos="720"/>
+        </w:tabs>
+        <w:ind w:left="720" w:hanging="360"/>
+      </w:pPr>
+    </w:lvl>
+    <w:lvl w:ilvl="1">
+      <w:start w:val="1"/>
+      <w:numFmt w:val="bullet"/>
+      <w:lvlText w:val="o"/>
+      <w:lvlJc w:val="left"/>
+      <w:pPr>
+        <w:tabs>
+          <w:tab w:val="num" w:pos="1440"/>
+        </w:tabs>
+        <w:ind w:left="1440" w:hanging="360"/>
+      </w:pPr>
+      <w:rPr>
+        <w:rFonts w:ascii="Courier New" w:hAnsi="Courier New" w:hint="default"/>
+        <w:sz w:val="20"/>
+      </w:rPr>
+    </w:lvl>
+    <w:lvl w:ilvl="2" w:tentative="1">
+      <w:start w:val="1"/>
+      <w:numFmt w:val="decimal"/>
+      <w:lvlText w:val="%3."/>
+      <w:lvlJc w:val="left"/>
+      <w:pPr>
+        <w:tabs>
+          <w:tab w:val="num" w:pos="2160"/>
+        </w:tabs>
+        <w:ind w:left="2160" w:hanging="360"/>
+      </w:pPr>
+    </w:lvl>
+    <w:lvl w:ilvl="3" w:tentative="1">
+      <w:start w:val="1"/>
+      <w:numFmt w:val="decimal"/>
+      <w:lvlText w:val="%4."/>
+      <w:lvlJc w:val="left"/>
+      <w:pPr>
+        <w:tabs>
+          <w:tab w:val="num" w:pos="2880"/>
+        </w:tabs>
+        <w:ind w:left="2880" w:hanging="360"/>
+      </w:pPr>
+    </w:lvl>
+    <w:lvl w:ilvl="4" w:tentative="1">
+      <w:start w:val="1"/>
+      <w:numFmt w:val="decimal"/>
+      <w:lvlText w:val="%5."/>
+      <w:lvlJc w:val="left"/>
+      <w:pPr>
+        <w:tabs>
+          <w:tab w:val="num" w:pos="3600"/>
+        </w:tabs>
+        <w:ind w:left="3600" w:hanging="360"/>
+      </w:pPr>
+    </w:lvl>
+    <w:lvl w:ilvl="5" w:tentative="1">
+      <w:start w:val="1"/>
+      <w:numFmt w:val="decimal"/>
+      <w:lvlText w:val="%6."/>
+      <w:lvlJc w:val="left"/>
+      <w:pPr>
+        <w:tabs>
+          <w:tab w:val="num" w:pos="4320"/>
+        </w:tabs>
+        <w:ind w:left="4320" w:hanging="360"/>
+      </w:pPr>
+    </w:lvl>
+    <w:lvl w:ilvl="6" w:tentative="1">
+      <w:start w:val="1"/>
+      <w:numFmt w:val="decimal"/>
+      <w:lvlText w:val="%7."/>
+      <w:lvlJc w:val="left"/>
+      <w:pPr>
+        <w:tabs>
+          <w:tab w:val="num" w:pos="5040"/>
+        </w:tabs>
+        <w:ind w:left="5040" w:hanging="360"/>
+      </w:pPr>
+    </w:lvl>
+    <w:lvl w:ilvl="7" w:tentative="1">
+      <w:start w:val="1"/>
+      <w:numFmt w:val="decimal"/>
+      <w:lvlText w:val="%8."/>
+      <w:lvlJc w:val="left"/>
+      <w:pPr>
+        <w:tabs>
+          <w:tab w:val="num" w:pos="5760"/>
+        </w:tabs>
+        <w:ind w:left="5760" w:hanging="360"/>
+      </w:pPr>
+    </w:lvl>
+    <w:lvl w:ilvl="8" w:tentative="1">
+      <w:start w:val="1"/>
+      <w:numFmt w:val="decimal"/>
+      <w:lvlText w:val="%9."/>
+      <w:lvlJc w:val="left"/>
+      <w:pPr>
+        <w:tabs>
+          <w:tab w:val="num" w:pos="6480"/>
+        </w:tabs>
+        <w:ind w:left="6480" w:hanging="360"/>
+      </w:pPr>
+    </w:lvl>
+  </w:abstractNum>
+  <w:abstractNum w:abstractNumId="12" w15:restartNumberingAfterBreak="0">
     <w:nsid w:val="5E2F7B0C"/>
     <w:multiLevelType w:val="multilevel"/>
     <w:tmpl w:val="A4280D7E"/>
@@ -5650,7 +5963,7 @@
       </w:rPr>
     </w:lvl>
   </w:abstractNum>
-  <w:abstractNum w:abstractNumId="12" w15:restartNumberingAfterBreak="0">
+  <w:abstractNum w:abstractNumId="13" w15:restartNumberingAfterBreak="0">
     <w:nsid w:val="7CDC487B"/>
     <w:multiLevelType w:val="multilevel"/>
     <w:tmpl w:val="BD063BF6"/>
@@ -5812,7 +6125,7 @@
     <w:abstractNumId w:val="8"/>
   </w:num>
   <w:num w:numId="5" w16cid:durableId="1903756501">
-    <w:abstractNumId w:val="11"/>
+    <w:abstractNumId w:val="12"/>
   </w:num>
   <w:num w:numId="6" w16cid:durableId="1831017411">
     <w:abstractNumId w:val="2"/>
@@ -5824,7 +6137,7 @@
     <w:abstractNumId w:val="0"/>
   </w:num>
   <w:num w:numId="9" w16cid:durableId="1325284295">
-    <w:abstractNumId w:val="12"/>
+    <w:abstractNumId w:val="13"/>
   </w:num>
   <w:num w:numId="10" w16cid:durableId="849878962">
     <w:abstractNumId w:val="1"/>
@@ -5837,6 +6150,9 @@
   </w:num>
   <w:num w:numId="13" w16cid:durableId="406462726">
     <w:abstractNumId w:val="7"/>
+  </w:num>
+  <w:num w:numId="14" w16cid:durableId="2135519733">
+    <w:abstractNumId w:val="11"/>
   </w:num>
 </w:numbering>
 </file>

</xml_diff>